<commit_message>
Fix Devin Review: bootstrap empty guard, antipsychotic mean k 0.856->0.857
- Add guard for empty bootstrap arrays in bootstrap_weibull_ci()
- Fix antipsychotic mean k: hardcoded 0.856 -> 0.857 to match np.mean([0.958,0.916,0.922,0.923,0.737,0.683])=0.8565->0.857
- Updated in both generate_all_manuscripts.py and generate_manuscripts.py
- Regenerated all 7 manuscripts with corrected values

Co-Authored-By: Tatsuki Onishi <bougtoir@gmail.com>
</commit_message>
<xml_diff>
--- a/weibull-clinical-dropout/manuscripts/weibull_5domain_comparison_EN.docx
+++ b/weibull-clinical-dropout/manuscripts/weibull_5domain_comparison_EN.docx
@@ -79,7 +79,7 @@
         <w:spacing w:before="0" w:after="120" w:line="276" w:lineRule="auto"/>
       </w:pPr>
       <w:r>
-        <w:t>Results: All 27 datasets yielded k &lt; 1 (range: 0.511-0.958, median 0.689), confirming universal DFR. Model fit was excellent (R² median 0.9970). Domain-level mean k: HIV/ART 0.597, antipsychotic 0.856, substance use 0.639, cardiac rehab 0.689, clinical trials 0.708.</w:t>
+        <w:t>Results: All 27 datasets yielded k &lt; 1 (range: 0.511-0.958, median 0.689), confirming universal DFR. Model fit was excellent (R² median 0.9970). Domain-level mean k: HIV/ART 0.597, antipsychotic 0.857, substance use 0.639, cardiac rehab 0.689, clinical trials 0.708.</w:t>
       </w:r>
     </w:p>
     <w:p>
@@ -372,7 +372,7 @@
           </w:tcPr>
           <w:p>
             <w:r>
-              <w:t>0.856 (0.683-0.958)</w:t>
+              <w:t>0.857 (0.683-0.958)</w:t>
             </w:r>
           </w:p>
         </w:tc>

</xml_diff>